<commit_message>
Verify the one-command claim and correct the timing
`make clean all` from an empty database: 4m28s, all 12 steps, 114 tests, 10 of
10 questions answered on the first attempt and matching the reference, DDR
rendered and verified at 2 pages. Every artefact in deliverables/ is from that
run.

The pipeline was estimated at "about six minutes" in the README, the DDR, the
workbook and the walkthrough notes. Measured, it is 4m28s, so all four now say
that instead - an estimate presented as a measurement is the same class of
mistake as an unverified number in a report.

Co-Authored-By: Claude Opus 5 <noreply@anthropic.com>
Claude-Session: https://claude.ai/code/session_0165Za6gtPggDtMyRg2Z7ePj
</commit_message>
<xml_diff>
--- a/deliverables/DDR.docx
+++ b/deliverables/DDR.docx
@@ -60,7 +60,7 @@
         <w:t>make all</w:t>
       </w:r>
       <w:r>
-        <w:t xml:space="preserve"> runs it end to end in about six minutes.</w:t>
+        <w:t xml:space="preserve"> runs it end to end in four and a half minutes, measured from an empty database.</w:t>
       </w:r>
     </w:p>
     <w:p>
@@ -728,7 +728,7 @@
           <w:color w:val="808080"/>
           <w:sz w:val="13"/>
         </w:rPr>
-        <w:t>Generated by `make ddr` at 2026-10-22T10:47:18+00:00 (git 95de493). Source text: deliverables/DDR_source.md</w:t>
+        <w:t>Generated by `make ddr` at 2026-10-22T10:55:20+00:00 (git b11c23f). Source text: deliverables/DDR_source.md</w:t>
       </w:r>
     </w:p>
     <w:sectPr>

</xml_diff>

<commit_message>
Regenerate the deliverables from b5b18f2, and add the delivery audit
Generated only, from a clean tree: the submission workbook (11 tabs), the DDR
(2 pages, counted by Word and in the PDF), the status report and the ZIP
(183 members). The DQ report, defect register and model explanation were
regenerated from 1b837fd, whose build code is identical; the defect register
differs from the previous one in one illustrative example only.

docs/DELIVERY_AUDIT.md maps each claim to its source and to the deliverables
that repeat it, records the commands run and their results (full suite on
1b837fd: 327 passed, 1 skipped; tests/test_auth.py on b5b18f2: 40 passed,
1 xfailed), and lists the open items in priority order.

Co-Authored-By: Claude Opus 5.5 <noreply@anthropic.com>
</commit_message>
<xml_diff>
--- a/deliverables/DDR.docx
+++ b/deliverables/DDR.docx
@@ -37,30 +37,20 @@
         <w:rPr>
           <w:b/>
         </w:rPr>
-        <w:t>Context.</w:t>
+        <w:t>Context and problem.</w:t>
       </w:r>
       <w:r>
-        <w:t xml:space="preserve"> Turn seven raw banking tables (1.06 m transactions, 5,369 clients, 4,500 accounts, 682 loans) into a trusted, documented, entitlement-aware data product that an AI assistant can query correctly, and answer ten business questions through it. The brief warns that time spent on infrastructure is time misread, so the stack is one database, numbered SQL files, plain Python and a Makefile: </w:t>
+        <w:t xml:space="preserve"> Turn eight raw banking files (1,079,680 rows: 1.06 m transactions, 5,369 clients, 4,500 accounts, 682 loans) into a trusted, documented, entitlement-aware data product that an AI assistant can query correctly, and answer the ten business questions through it. The brief warns against infrastructure work, so the stack is one PostgreSQL database, numbered SQL files, plain Python and a Makefile (</w:t>
       </w:r>
       <w:r>
         <w:rPr>
           <w:rFonts w:ascii="Consolas" w:hAnsi="Consolas"/>
           <w:sz w:val="17"/>
         </w:rPr>
-        <w:t>make up</w:t>
+        <w:t>scripts\windows.ps1</w:t>
       </w:r>
       <w:r>
-        <w:t xml:space="preserve"> starts it, </w:t>
-      </w:r>
-      <w:r>
-        <w:rPr>
-          <w:rFonts w:ascii="Consolas" w:hAnsi="Consolas"/>
-          <w:sz w:val="17"/>
-        </w:rPr>
-        <w:t>make all</w:t>
-      </w:r>
-      <w:r>
-        <w:t xml:space="preserve"> runs it end to end in four and a half minutes, measured from an empty database.</w:t>
+        <w:t xml:space="preserve"> on native Windows). Labels: [RUN] executed, [CODE] in the source, [LLM] model output, [REC] recommended but not built, [ASSUMED] awaiting business confirmation.</w:t>
       </w:r>
     </w:p>
     <w:p>
@@ -85,7 +75,7 @@
         <w:rPr>
           <w:b/>
         </w:rPr>
-        <w:t>1. PostgreSQL 16, with the pipeline as SQL files plus Python orchestration.</w:t>
+        <w:t>1. PostgreSQL, with the pipeline as SQL files plus Python orchestration.</w:t>
       </w:r>
       <w:r>
         <w:t xml:space="preserve"> </w:t>
@@ -106,7 +96,7 @@
         <w:t>Choice:</w:t>
       </w:r>
       <w:r>
-        <w:t xml:space="preserve"> PostgreSQL. </w:t>
+        <w:t xml:space="preserve"> PostgreSQL (16 on the Linux/Docker build, 18 on the native Windows build; identical DDL). </w:t>
       </w:r>
       <w:r>
         <w:rPr>
@@ -115,7 +105,7 @@
         <w:t>Why:</w:t>
       </w:r>
       <w:r>
-        <w:t xml:space="preserve"> Task 3 is enforcement, and the only honest way to show that an LLM-generated query cannot bypass an entitlement filter is to put the filter in the engine and prove it by connecting as a restricted user. DuckDB has no row level security, so that task would have become prose and untested SQL. A warehouse would also have contradicted the bank's own direction of travel, which is back on-premises for data sovereignty. </w:t>
+        <w:t xml:space="preserve"> Task 3 is enforcement, and the only honest way to show that a generated query cannot bypass an entitlement filter is to put the filter in the engine and prove it by connecting as a restricted user. DuckDB has no row level security, so that task would have become prose. </w:t>
       </w:r>
       <w:r>
         <w:rPr>
@@ -124,7 +114,7 @@
         <w:t>Cost:</w:t>
       </w:r>
       <w:r>
-        <w:t xml:space="preserve"> no built-in lineage or scheduling, and a single node. Both are acceptable at this volume and neither is on the critical path of the brief.</w:t>
+        <w:t xml:space="preserve"> no built-in lineage or scheduling, and a single node; acceptable at this volume and off the critical path of the brief.</w:t>
       </w:r>
     </w:p>
     <w:p>
@@ -136,7 +126,108 @@
         <w:rPr>
           <w:b/>
         </w:rPr>
-        <w:t>2. Cleaning types, normalises, decodes and derives -- and never repairs.</w:t>
+        <w:t>2. Bronze, silver, gold -- and cleaning that never repairs.</w:t>
+      </w:r>
+      <w:r>
+        <w:t xml:space="preserve"> </w:t>
+      </w:r>
+      <w:r>
+        <w:rPr>
+          <w:rFonts w:ascii="Consolas" w:hAnsi="Consolas"/>
+          <w:sz w:val="17"/>
+        </w:rPr>
+        <w:t>raw</w:t>
+      </w:r>
+      <w:r>
+        <w:t xml:space="preserve"> holds the files verbatim as text, hashed per file; </w:t>
+      </w:r>
+      <w:r>
+        <w:rPr>
+          <w:rFonts w:ascii="Consolas" w:hAnsi="Consolas"/>
+          <w:sz w:val="17"/>
+        </w:rPr>
+        <w:t>stg</w:t>
+      </w:r>
+      <w:r>
+        <w:t xml:space="preserve"> types, decodes and resolves the transaction sign once, and filters nothing; the rule layer grades defects; </w:t>
+      </w:r>
+      <w:r>
+        <w:rPr>
+          <w:rFonts w:ascii="Consolas" w:hAnsi="Consolas"/>
+          <w:sz w:val="17"/>
+        </w:rPr>
+        <w:t>core</w:t>
+      </w:r>
+      <w:r>
+        <w:t xml:space="preserve"> is the model; </w:t>
+      </w:r>
+      <w:r>
+        <w:rPr>
+          <w:rFonts w:ascii="Consolas" w:hAnsi="Consolas"/>
+          <w:sz w:val="17"/>
+        </w:rPr>
+        <w:t>ai</w:t>
+      </w:r>
+      <w:r>
+        <w:t xml:space="preserve"> is the curated surface. </w:t>
+      </w:r>
+      <w:r>
+        <w:rPr>
+          <w:i/>
+        </w:rPr>
+        <w:t>Options:</w:t>
+      </w:r>
+      <w:r>
+        <w:t xml:space="preserve"> repair bad values; drop defective rows; or transform without overwriting and let a graded rule layer decide what reaches the product. </w:t>
+      </w:r>
+      <w:r>
+        <w:rPr>
+          <w:i/>
+        </w:rPr>
+        <w:t>Choice:</w:t>
+      </w:r>
+      <w:r>
+        <w:t xml:space="preserve"> the third. </w:t>
+      </w:r>
+      <w:r>
+        <w:rPr>
+          <w:i/>
+        </w:rPr>
+        <w:t>Why:</w:t>
+      </w:r>
+      <w:r>
+        <w:t xml:space="preserve"> a repaired value is indistinguishable from an observed one a week later, and a silent drop changes every denominator. Of 21 cleaning steps one removes a row (quarantine, 1 row), and core = staging - quarantine is checked on rows and money after every build [RUN]. Every changed value survives in a </w:t>
+      </w:r>
+      <w:r>
+        <w:rPr>
+          <w:rFonts w:ascii="Consolas" w:hAnsi="Consolas"/>
+          <w:sz w:val="17"/>
+        </w:rPr>
+        <w:t>_raw</w:t>
+      </w:r>
+      <w:r>
+        <w:t xml:space="preserve"> column. </w:t>
+      </w:r>
+      <w:r>
+        <w:rPr>
+          <w:i/>
+        </w:rPr>
+        <w:t>Cost:</w:t>
+      </w:r>
+      <w:r>
+        <w:t xml:space="preserve"> the product carries flagged rows whose caveat a consumer must read.</w:t>
+      </w:r>
+    </w:p>
+    <w:p>
+      <w:pPr>
+        <w:spacing w:after="60"/>
+        <w:jc w:val="both"/>
+      </w:pPr>
+      <w:r>
+        <w:rPr>
+          <w:b/>
+        </w:rPr>
+        <w:t>3. Star schema with a bridge, plus curated views.</w:t>
       </w:r>
       <w:r>
         <w:t xml:space="preserve"> </w:t>
@@ -148,7 +239,7 @@
         <w:t>Options:</w:t>
       </w:r>
       <w:r>
-        <w:t xml:space="preserve"> repair bad values (impute the missing rate, correct the balance); drop any row with a defect; or transform without overwriting an observation and let a separate graded rule layer decide what reaches the product. </w:t>
+        <w:t xml:space="preserve"> one wide table at posting grain; Data Vault; the source model. </w:t>
       </w:r>
       <w:r>
         <w:rPr>
@@ -157,7 +248,7 @@
         <w:t>Choice:</w:t>
       </w:r>
       <w:r>
-        <w:t xml:space="preserve"> the third. Staging states it as a contract -- nothing is filtered there -- so the rule layer can report on the source rather than on what survived the loader. </w:t>
+        <w:t xml:space="preserve"> four dimensions, one bridge, two base facts and a derived month-end balance fact. </w:t>
       </w:r>
       <w:r>
         <w:rPr>
@@ -166,27 +257,17 @@
         <w:t>Why:</w:t>
       </w:r>
       <w:r>
-        <w:t xml:space="preserve"> a repaired value is indistinguishable from an observed one a week later, which is intolerable in a product someone will reconcile against a statement; dropping silently changes every denominator. Of 21 cleaning steps, exactly one removes a row (quarantine), it removed 1, and the reconciliation proves core = staging - quarantine on both rows and money. Every value the cleaning changed survives in a </w:t>
+        <w:t xml:space="preserve"> the ten questions have four grains (client, account, loan, posting); a wide table turns every count into </w:t>
       </w:r>
       <w:r>
         <w:rPr>
           <w:rFonts w:ascii="Consolas" w:hAnsi="Consolas"/>
           <w:sz w:val="17"/>
         </w:rPr>
-        <w:t>_raw</w:t>
+        <w:t>count(distinct ...)</w:t>
       </w:r>
       <w:r>
-        <w:t xml:space="preserve"> column with a note, so each step is reversible and therefore checkable. The highest-value step is the smallest: resolving the transaction sign once (</w:t>
-      </w:r>
-      <w:r>
-        <w:rPr>
-          <w:rFonts w:ascii="Consolas" w:hAnsi="Consolas"/>
-          <w:sz w:val="17"/>
-        </w:rPr>
-        <w:t>signed_amount</w:t>
-      </w:r>
-      <w:r>
-        <w:t xml:space="preserve">, credits positive) rather than leaving every consumer to encode that the Czech words VYDAJ and VYBER both mean outgoing -- the most likely way for a generated query to return a confident wrong number. </w:t>
+        <w:t xml:space="preserve">, the construct generated SQL gets wrong quietly. Data Vault suits many sources with history; there is one source and one extract. </w:t>
       </w:r>
       <w:r>
         <w:rPr>
@@ -195,17 +276,26 @@
         <w:t>Cost:</w:t>
       </w:r>
       <w:r>
-        <w:t xml:space="preserve"> the product carries known-bad rows with flags on them, so a consumer has to read a caveat; and the audit columns are dead weight on the tables that have no defects. Every step, with its effect measured by a probe at build time, is in </w:t>
+        <w:t xml:space="preserve"> joins, each declared in the semantic layer with a measured cardinality, and a derived fact to rebuild. </w:t>
+      </w:r>
+      <w:r>
+        <w:rPr>
+          <w:i/>
+        </w:rPr>
+        <w:t>Known limitation, not changed in this delivery:</w:t>
+      </w:r>
+      <w:r>
+        <w:t xml:space="preserve"> the month-end fact breaks same-day ties by the highest </w:t>
       </w:r>
       <w:r>
         <w:rPr>
           <w:rFonts w:ascii="Consolas" w:hAnsi="Consolas"/>
           <w:sz w:val="17"/>
         </w:rPr>
-        <w:t>docs/CLEANING_LEDGER.md</w:t>
+        <w:t>trans_id</w:t>
       </w:r>
       <w:r>
-        <w:t xml:space="preserve"> and the workbook's Cleaning tab.</w:t>
+        <w:t>, which is not chronological (A14, caveat C2). The Q9 average is robust to it (about 2 CZK under a chain-based rule), individual account balances are not [REC].</w:t>
       </w:r>
     </w:p>
     <w:p>
@@ -217,99 +307,10 @@
         <w:rPr>
           <w:b/>
         </w:rPr>
-        <w:t>3. Star schema with a bridge table, plus three curated views.</w:t>
+        <w:t>4. Three severities, each with a mechanical consequence.</w:t>
       </w:r>
       <w:r>
         <w:t xml:space="preserve"> </w:t>
-      </w:r>
-      <w:r>
-        <w:rPr>
-          <w:i/>
-        </w:rPr>
-        <w:t>Options:</w:t>
-      </w:r>
-      <w:r>
-        <w:t xml:space="preserve"> one big table flattened onto the transaction; Data Vault; keep the source model. </w:t>
-      </w:r>
-      <w:r>
-        <w:rPr>
-          <w:i/>
-        </w:rPr>
-        <w:t>Choice:</w:t>
-      </w:r>
-      <w:r>
-        <w:t xml:space="preserve"> star schema -- four dimensions, one bridge, two base facts, one derived fact. </w:t>
-      </w:r>
-      <w:r>
-        <w:rPr>
-          <w:i/>
-        </w:rPr>
-        <w:t>Why:</w:t>
-      </w:r>
-      <w:r>
-        <w:t xml:space="preserve"> the ten questions have four different grains (client, account, loan, posting). One big table at posting grain turns every count of clients, accounts and loans into </w:t>
-      </w:r>
-      <w:r>
-        <w:rPr>
-          <w:rFonts w:ascii="Consolas" w:hAnsi="Consolas"/>
-          <w:sz w:val="17"/>
-        </w:rPr>
-        <w:t>count(distinct ...)</w:t>
-      </w:r>
-      <w:r>
-        <w:t xml:space="preserve">, which is exactly the construct generated SQL gets wrong quietly. Data Vault is the right answer for integrating many sources with history; there is one source and a single 1999 extract, so it would triple the object count before a single question could be answered. The source model hides its meaning in Czech codes and in a disposition table whose </w:t>
-      </w:r>
-      <w:r>
-        <w:rPr>
-          <w:rFonts w:ascii="Consolas" w:hAnsi="Consolas"/>
-          <w:sz w:val="17"/>
-        </w:rPr>
-        <w:t>type</w:t>
-      </w:r>
-      <w:r>
-        <w:t xml:space="preserve"> column decides who owns an account -- deciding that once is the modelling work. </w:t>
-      </w:r>
-      <w:r>
-        <w:rPr>
-          <w:i/>
-        </w:rPr>
-        <w:t>Cost:</w:t>
-      </w:r>
-      <w:r>
-        <w:t xml:space="preserve"> joins, and a derived month-end balance fact that has to be rebuilt. The curated views give the model a join-free surface anyway.</w:t>
-      </w:r>
-    </w:p>
-    <w:p>
-      <w:pPr>
-        <w:spacing w:after="60"/>
-        <w:jc w:val="both"/>
-      </w:pPr>
-      <w:r>
-        <w:rPr>
-          <w:b/>
-        </w:rPr>
-        <w:t>4. Three severities, with a mechanical consequence each.</w:t>
-      </w:r>
-      <w:r>
-        <w:t xml:space="preserve"> </w:t>
-      </w:r>
-      <w:r>
-        <w:rPr>
-          <w:i/>
-        </w:rPr>
-        <w:t>Options:</w:t>
-      </w:r>
-      <w:r>
-        <w:t xml:space="preserve"> reject every defective row; repair silently; grade the defects. </w:t>
-      </w:r>
-      <w:r>
-        <w:rPr>
-          <w:i/>
-        </w:rPr>
-        <w:t>Choice:</w:t>
-      </w:r>
-      <w:r>
-        <w:t xml:space="preserve"> grade them -- </w:t>
       </w:r>
       <w:r>
         <w:rPr>
@@ -319,7 +320,7 @@
         <w:t>block</w:t>
       </w:r>
       <w:r>
-        <w:t xml:space="preserve"> quarantines the row and keeps it out of the product, </w:t>
+        <w:t xml:space="preserve"> quarantines the row, </w:t>
       </w:r>
       <w:r>
         <w:rPr>
@@ -329,7 +330,7 @@
         <w:t>warn</w:t>
       </w:r>
       <w:r>
-        <w:t xml:space="preserve"> keeps the row and attaches a flag that travels into the model and into the semantic layer, </w:t>
+        <w:t xml:space="preserve"> keeps it with a flag that travels into the model and the semantic layer, </w:t>
       </w:r>
       <w:r>
         <w:rPr>
@@ -339,7 +340,7 @@
         <w:t>info</w:t>
       </w:r>
       <w:r>
-        <w:t xml:space="preserve"> standardises and logs. </w:t>
+        <w:t xml:space="preserve"> standardises and logs. 124 rules cover completeness, uniqueness, referential integrity, validity, cross-table consistency and reconciliation; 19 fire as 14 defect types, 1 row is quarantined and 440 are flagged [RUN]. </w:t>
       </w:r>
       <w:r>
         <w:rPr>
@@ -348,7 +349,17 @@
         <w:t>Why:</w:t>
       </w:r>
       <w:r>
-        <w:t xml:space="preserve"> a severity without a consequence is a comment. The clearest case in this data: 14 transactions have an amount of exactly zero. The naive rule ("amount must be positive") is defensible and, at </w:t>
+        <w:t xml:space="preserve"> a severity without a consequence is a comment. The 14 zero-amount postings are </w:t>
+      </w:r>
+      <w:r>
+        <w:rPr>
+          <w:rFonts w:ascii="Consolas" w:hAnsi="Consolas"/>
+          <w:sz w:val="17"/>
+        </w:rPr>
+        <w:t>info</w:t>
+      </w:r>
+      <w:r>
+        <w:t xml:space="preserve">: at </w:t>
       </w:r>
       <w:r>
         <w:rPr>
@@ -358,17 +369,7 @@
         <w:t>block</w:t>
       </w:r>
       <w:r>
-        <w:t xml:space="preserve">, would quarantine 14 valid interest postings and break 14 accounts' balance chains to fix nothing -- so it is </w:t>
-      </w:r>
-      <w:r>
-        <w:rPr>
-          <w:rFonts w:ascii="Consolas" w:hAnsi="Consolas"/>
-          <w:sz w:val="17"/>
-        </w:rPr>
-        <w:t>info</w:t>
-      </w:r>
-      <w:r>
-        <w:t xml:space="preserve">. Conversely one duplicate transaction by business key is </w:t>
+        <w:t xml:space="preserve"> the naive rule would quarantine valid interest postings and break 14 balance chains to fix nothing. One duplicate transaction by business key is </w:t>
       </w:r>
       <w:r>
         <w:rPr>
@@ -378,7 +379,7 @@
         <w:t>block</w:t>
       </w:r>
       <w:r>
-        <w:t xml:space="preserve">: same account, date, type, amount and resulting balance as another posting, which no primary key can catch and which double counts a flow. </w:t>
+        <w:t xml:space="preserve">: it double counts a flow and no primary key catches it. </w:t>
       </w:r>
       <w:r>
         <w:rPr>
@@ -387,7 +388,7 @@
         <w:t>Cost:</w:t>
       </w:r>
       <w:r>
-        <w:t xml:space="preserve"> three code paths instead of one, and a quarantine table to keep. In exchange, every exclusion is reversible, countable and attributable to a named rule.</w:t>
+        <w:t xml:space="preserve"> three code paths and a quarantine table; in exchange every exclusion is reversible, countable and attributable to a rule.</w:t>
       </w:r>
     </w:p>
     <w:p>
@@ -411,7 +412,7 @@
         <w:t>Options:</w:t>
       </w:r>
       <w:r>
-        <w:t xml:space="preserve"> describe the schema in the prompt; use a BI tool's metrics layer; write the semantics as a file the pipeline checks. </w:t>
+        <w:t xml:space="preserve"> the schema in the prompt; a BI tool's metrics layer; a file the pipeline checks. </w:t>
       </w:r>
       <w:r>
         <w:rPr>
@@ -420,7 +421,7 @@
         <w:t>Choice:</w:t>
       </w:r>
       <w:r>
-        <w:t xml:space="preserve"> a YAML file -- entities with their grain, certified metric expressions, a glossary that says what each term is </w:t>
+        <w:t xml:space="preserve"> one YAML file -- entities with their grain, certified metrics with their time column, joins with cardinality, a glossary of what each term is </w:t>
       </w:r>
       <w:r>
         <w:rPr>
@@ -429,7 +430,7 @@
         <w:t>not</w:t>
       </w:r>
       <w:r>
-        <w:t xml:space="preserve">, and the data quality caveats with row counts -- which the build validates against the live database. A described column that does not exist, an existing column nobody described, or a declared grain that is not actually one row per key all fail the build. </w:t>
+        <w:t xml:space="preserve">, and the data quality caveats with counts -- validated against the live database on every build. A non-existent or undescribed column, a false grain, a wrong join cardinality, a stale row count or a metric built on a column that does not exist fails the build [RUN]. Definitions live here once: a problematic loan is status B or D, 76 of 682 = 11.14% (A4 [ASSUMED]). </w:t>
       </w:r>
       <w:r>
         <w:rPr>
@@ -438,7 +439,7 @@
         <w:t>Why:</w:t>
       </w:r>
       <w:r>
-        <w:t xml:space="preserve"> a semantic layer that has drifted from the schema is worse than none, because it gives the model confident wrong information and the model cannot check it. </w:t>
+        <w:t xml:space="preserve"> a drifted layer gives the model confident wrong information it cannot check. </w:t>
       </w:r>
       <w:r>
         <w:rPr>
@@ -447,16 +448,7 @@
         <w:t>Cost:</w:t>
       </w:r>
       <w:r>
-        <w:t xml:space="preserve"> the layer has to be maintained alongside the model; the validator is what makes that safe. </w:t>
-      </w:r>
-      <w:r>
-        <w:rPr>
-          <w:i/>
-        </w:rPr>
-        <w:t>Result:</w:t>
-      </w:r>
-      <w:r>
-        <w:t xml:space="preserve"> the model answered 10 of 10 questions on the first attempt, matching all ten hand-written reference answers, with no retry and no SQL hand-corrected.</w:t>
+        <w:t xml:space="preserve"> it is maintained alongside the model; the validator makes that safe.</w:t>
       </w:r>
     </w:p>
     <w:p>
@@ -489,7 +481,7 @@
         <w:t>Choice:</w:t>
       </w:r>
       <w:r>
-        <w:t xml:space="preserve"> policies, with the gateway's SQL guard kept as a second line. </w:t>
+        <w:t xml:space="preserve"> policies, with the SQL guard as a separate second line. </w:t>
       </w:r>
       <w:r>
         <w:rPr>
@@ -498,7 +490,7 @@
         <w:t>Why:</w:t>
       </w:r>
       <w:r>
-        <w:t xml:space="preserve"> asking the model to filter itself is a request, not a control -- the thing being filtered is the thing being asked to apply the filter. A gateway is real but one unanticipated query shape defeats it. A policy sits inside the plan of every statement on the connection; the model only ever emits text, and the predicate is not in the text, so rewriting the text cannot remove it. Identity comes from the authenticated database role rather than a session variable, because a variable can be set by anything that can send SQL. Nine bypass attempts are in the test suite and all nine fail. Unrestricted access is modelled as a portfolio containing every client, not as an exemption: the bank-wide user has </w:t>
+        <w:t xml:space="preserve"> asking the model to filter itself is a request, not a control, and a gateway is defeated by one unanticipated query shape. A policy sits inside the plan of every statement; the model only emits text and the predicate is not in the text. Identity is the database role a two-factor login authenticated, not a session variable. Access is derived from data: ownership and portfolios grant clients, a disposition grants that one account and never its owner (D023, D024), delegations expire. Unrestricted access is a portfolio of every client, not an exemption (</w:t>
       </w:r>
       <w:r>
         <w:rPr>
@@ -508,16 +500,17 @@
         <w:t>rolbypassrls = false</w:t>
       </w:r>
       <w:r>
-        <w:t xml:space="preserve"> and goes through the policies like everyone else. The model carries two grains of principal on one policy set: staff entitled to the union of their portfolios, and self-service customers entitled to exactly themselves. Adding the second grain cost one column, one UNION in the resolution view and a check constraint; it changed no policy and no consumer view, which is the test that the filter really does live in one place. The consequence is the sharp one: two customers of the </w:t>
+        <w:t xml:space="preserve">). Nine bypass attempts and the cross-client attempts are refused in the test suite [RUN]. Onboarding is inserts and one credential; offboarding is one </w:t>
       </w:r>
       <w:r>
         <w:rPr>
-          <w:i/>
+          <w:rFonts w:ascii="Consolas" w:hAnsi="Consolas"/>
+          <w:sz w:val="17"/>
         </w:rPr>
-        <w:t>same</w:t>
+        <w:t>UPDATE</w:t>
       </w:r>
       <w:r>
-        <w:t xml:space="preserve"> relationship manager cannot see each other, and 13 targeted attempts by one to read the other -- including going around the views to the base table -- all return nothing. Onboarding is inserts and one credential: four for a staff book, one for a customer. </w:t>
+        <w:t xml:space="preserve">. </w:t>
       </w:r>
       <w:r>
         <w:rPr>
@@ -526,7 +519,7 @@
         <w:t>Cost:</w:t>
       </w:r>
       <w:r>
-        <w:t xml:space="preserve"> a database role per user, which conflicts with naive connection pooling; the practical answers are a pool per role or </w:t>
+        <w:t xml:space="preserve"> a database role per user, which conflicts with naive connection pooling (a pool per role, or </w:t>
       </w:r>
       <w:r>
         <w:rPr>
@@ -536,7 +529,7 @@
         <w:t>SET ROLE</w:t>
       </w:r>
       <w:r>
-        <w:t xml:space="preserve"> performed by a trusted gateway on a privileged connection, where the gateway and not the model picks the role. Two controls a real deployment needs and this build does not have: a read audit log, and field-level masking.</w:t>
+        <w:t xml:space="preserve"> by a trusted gateway). A real bank also needs a read audit log and field masking [REC].</w:t>
       </w:r>
     </w:p>
     <w:p>
@@ -548,39 +541,38 @@
         <w:rPr>
           <w:b/>
         </w:rPr>
-        <w:t>7. The LLM is treated as an untrusted query author.</w:t>
+        <w:t>7. The LLM is an untrusted query author.</w:t>
       </w:r>
       <w:r>
-        <w:t xml:space="preserve"> It is called with no tools, no MCP servers, no filesystem and no database access, from a working directory outside the repository: it sees the rendered semantic layer and the question, and nothing else. Its SQL is parsed with sqlglot -- not pattern-matched -- and must be a single read-only statement on the </w:t>
+        <w:t xml:space="preserve"> It has no tools, no filesystem and no database: it sees the rendered semantic layer and the question. Its SQL is parsed with sqlglot and must be one read-only SELECT on </w:t>
       </w:r>
       <w:r>
         <w:rPr>
           <w:rFonts w:ascii="Consolas" w:hAnsi="Consolas"/>
           <w:sz w:val="17"/>
         </w:rPr>
-        <w:t>ai</w:t>
+        <w:t>ai.*</w:t>
       </w:r>
       <w:r>
-        <w:t xml:space="preserve"> schema, with a row cap and a statement timeout applied. </w:t>
+        <w:t xml:space="preserve">, calling no function outside the allowed schemas, under a row cap it cannot raise, a statement timeout and a read-only transaction, on the persona's own two-factor connection [CODE][RUN]. A name the schema does not have fails in the database and is reported, never answered. </w:t>
       </w:r>
       <w:r>
         <w:rPr>
           <w:i/>
         </w:rPr>
-        <w:t>Why parse rather than match:</w:t>
+        <w:t>Limit:</w:t>
       </w:r>
       <w:r>
-        <w:t xml:space="preserve"> </w:t>
+        <w:t xml:space="preserve"> passing the guard proves a query is safe, not that it answers the question; the intent verifier that would check meaning is a prototype only [REC]. </w:t>
       </w:r>
       <w:r>
         <w:rPr>
-          <w:rFonts w:ascii="Consolas" w:hAnsi="Consolas"/>
-          <w:sz w:val="17"/>
+          <w:i/>
         </w:rPr>
-        <w:t>SELECT 1 FROM ai.client/**/;/**/DELETE FROM core.fact_loan</w:t>
+        <w:t>Evidence:</w:t>
       </w:r>
       <w:r>
-        <w:t xml:space="preserve"> is one line to a regular expression and three statements to a parser. </w:t>
+        <w:t xml:space="preserve"> Claude Sonnet 5.5 answered all ten and 10 of 10 match the hand-written reference [LLM, recorded 2026-10-25, before the semantic audit changed the pack]. Ollama with qwen2.5-coder:3b is an optional free local provider; its run, kept separate, scored 6 match, 2 partial, 2 mismatch [LLM]. </w:t>
       </w:r>
       <w:r>
         <w:rPr>
@@ -589,7 +581,7 @@
         <w:t>Cost:</w:t>
       </w:r>
       <w:r>
-        <w:t xml:space="preserve"> a parser dependency, and legitimate queries are occasionally stricter than necessary (every table must be schema-qualified).</w:t>
+        <w:t xml:space="preserve"> every table must be schema-qualified.</w:t>
       </w:r>
     </w:p>
     <w:p>
@@ -611,7 +603,7 @@
         <w:jc w:val="both"/>
       </w:pPr>
       <w:r>
-        <w:t>At 100,000x this is 100 billion postings, 450 million accounts and 537 million clients -- roughly 10 TB of fact data before indexes. Four things break, in this order:</w:t>
+        <w:t>Reasoned, not benchmarked: 100 billion postings, 450 million accounts, about 10 TB of facts before indexes.</w:t>
       </w:r>
     </w:p>
     <w:p>
@@ -624,7 +616,7 @@
         <w:rPr>
           <w:b/>
         </w:rPr>
-        <w:t>The full-rebuild pipeline.</w:t>
+        <w:t>Ingestion and rebuilds.</w:t>
       </w:r>
       <w:r>
         <w:t xml:space="preserve"> </w:t>
@@ -637,7 +629,7 @@
         <w:t>core</w:t>
       </w:r>
       <w:r>
-        <w:t xml:space="preserve"> is built with </w:t>
+        <w:t xml:space="preserve"> is rebuilt with </w:t>
       </w:r>
       <w:r>
         <w:rPr>
@@ -647,7 +639,7 @@
         <w:t>CREATE TABLE AS</w:t>
       </w:r>
       <w:r>
-        <w:t xml:space="preserve"> from</w:t>
+        <w:t xml:space="preserve"> on every</w:t>
       </w:r>
     </w:p>
     <w:p>
@@ -656,7 +648,7 @@
         <w:jc w:val="both"/>
       </w:pPr>
       <w:r>
-        <w:t>staging on every run. At 10 TB that is hours of rewriting data that did not change. It becomes an incremental load: range-partition the transaction fact by month, rebuild only the open partition, and merge rather than replace. The layer contract and the SQL stay as they are; the write pattern changes.</w:t>
+        <w:t>run: hours of rewriting unchanged data. It becomes incremental: facts range-partitioned by month, only open partitions rebuilt, merge not replace.</w:t>
       </w:r>
     </w:p>
     <w:p>
@@ -672,7 +664,7 @@
         <w:t>The data quality runner.</w:t>
       </w:r>
       <w:r>
-        <w:t xml:space="preserve"> 124 rules, each a full scan, with violating</w:t>
+        <w:t xml:space="preserve"> 124 full scans, violating keys sampled through</w:t>
       </w:r>
     </w:p>
     <w:p>
@@ -681,7 +673,7 @@
         <w:jc w:val="both"/>
       </w:pPr>
       <w:r>
-        <w:t xml:space="preserve">rows materialised in Python to be sampled. The scans have to become partition-scoped (check what arrived, not what was already certified), the violating keys have to be written by </w:t>
+        <w:t xml:space="preserve">Python. Rules become partition-scoped (check what arrived), keys are written by </w:t>
       </w:r>
       <w:r>
         <w:rPr>
@@ -691,7 +683,7 @@
         <w:t>INSERT ... SELECT</w:t>
       </w:r>
       <w:r>
-        <w:t xml:space="preserve"> instead of travelling through Python, and the aggregate rules (the per-account balance reconciliation) need incremental state per account rather than a recomputation over all history. Row-level </w:t>
+        <w:t xml:space="preserve">, the balance reconciliation keeps per-account state, and </w:t>
       </w:r>
       <w:r>
         <w:rPr>
@@ -701,7 +693,7 @@
         <w:t>info</w:t>
       </w:r>
       <w:r>
-        <w:t xml:space="preserve"> rules move to sampling with a published confidence interval; </w:t>
+        <w:t xml:space="preserve"> rules are sampled with a stated confidence; </w:t>
       </w:r>
       <w:r>
         <w:rPr>
@@ -711,7 +703,7 @@
         <w:t>block</w:t>
       </w:r>
       <w:r>
-        <w:t xml:space="preserve"> rules stay exact, because quarantining is a decision about a specific row.</w:t>
+        <w:t xml:space="preserve"> stays exact.</w:t>
       </w:r>
     </w:p>
     <w:p>
@@ -724,10 +716,10 @@
         <w:rPr>
           <w:b/>
         </w:rPr>
-        <w:t>The month-end balance fact.</w:t>
+        <w:t>The month-end fact.</w:t>
       </w:r>
       <w:r>
-        <w:t xml:space="preserve"> 450 m accounts x 72 month ends is 32 billion</w:t>
+        <w:t xml:space="preserve"> 450 m accounts x 72 month ends is 32 bn rows rebuilt</w:t>
       </w:r>
     </w:p>
     <w:p>
@@ -736,7 +728,42 @@
         <w:jc w:val="both"/>
       </w:pPr>
       <w:r>
-        <w:t>pre-computed rows, and it is rebuilt from scratch today. It becomes an incrementally maintained snapshot: one new partition per month end, computed from the previous snapshot plus that month's postings, which is O(new postings) instead of O(all history).</w:t>
+        <w:t>from scratch. It becomes a snapshot maintained from the previous month plus that month's postings.</w:t>
+      </w:r>
+    </w:p>
+    <w:p>
+      <w:pPr>
+        <w:pStyle w:val="ListNumber"/>
+        <w:spacing w:after="60"/>
+        <w:jc w:val="both"/>
+      </w:pPr>
+      <w:r>
+        <w:rPr>
+          <w:b/>
+        </w:rPr>
+        <w:t>Latency and concurrency.</w:t>
+      </w:r>
+      <w:r>
+        <w:t xml:space="preserve"> Generated ad-hoc SQL over 10 TB is a full scan</w:t>
+      </w:r>
+    </w:p>
+    <w:p>
+      <w:pPr>
+        <w:spacing w:after="60"/>
+        <w:jc w:val="both"/>
+      </w:pPr>
+      <w:r>
+        <w:t xml:space="preserve">unless it prunes; many users exhaust one node and a role-per-user pool. Partitions and indexes on the certified time columns, pre-aggregated marts for certified metrics, per-tier timeouts and a pooled gateway doing </w:t>
+      </w:r>
+      <w:r>
+        <w:rPr>
+          <w:rFonts w:ascii="Consolas" w:hAnsi="Consolas"/>
+          <w:sz w:val="17"/>
+        </w:rPr>
+        <w:t>SET ROLE</w:t>
+      </w:r>
+      <w:r>
+        <w:t>.</w:t>
       </w:r>
     </w:p>
     <w:p>
@@ -752,14 +779,7 @@
         <w:t>The entitlement predicate.</w:t>
       </w:r>
       <w:r>
-        <w:t xml:space="preserve"> </w:t>
-      </w:r>
-      <w:r>
-        <w:rPr>
-          <w:rFonts w:ascii="Consolas" w:hAnsi="Consolas"/>
-          <w:sz w:val="17"/>
-        </w:rPr>
-        <w:t>account_id IN (SELECT ... FROM sec.v_my_accounts)</w:t>
+        <w:t xml:space="preserve"> A hash join over 4,500 accounts today; over</w:t>
       </w:r>
     </w:p>
     <w:p>
@@ -768,7 +788,7 @@
         <w:jc w:val="both"/>
       </w:pPr>
       <w:r>
-        <w:t xml:space="preserve">is a cheap hash join over 4,500 accounts and a large one when a portfolio holds millions. The entitlement resolution becomes a materialised, indexed table keyed </w:t>
+        <w:t xml:space="preserve">millions for a large portfolio. It becomes a materialised </w:t>
       </w:r>
       <w:r>
         <w:rPr>
@@ -778,16 +798,23 @@
         <w:t>(role, account_id)</w:t>
       </w:r>
       <w:r>
-        <w:t xml:space="preserve">, refreshed on change and co-partitioned with the fact so the filter is a partition-local semi-join. The </w:t>
+        <w:t xml:space="preserve"> table, refreshed on change and co-partitioned with the facts. The design does not change: still a policy, onboarding still an insert.</w:t>
+      </w:r>
+    </w:p>
+    <w:p>
+      <w:pPr>
+        <w:pStyle w:val="ListNumber"/>
+        <w:spacing w:after="60"/>
+        <w:jc w:val="both"/>
+      </w:pPr>
+      <w:r>
+        <w:rPr>
+          <w:b/>
+        </w:rPr>
+        <w:t>Evaluation and operations.</w:t>
       </w:r>
       <w:r>
-        <w:rPr>
-          <w:i/>
-        </w:rPr>
-        <w:t>design</w:t>
-      </w:r>
-      <w:r>
-        <w:t xml:space="preserve"> does not change -- the predicate is still a policy on the table, and onboarding is still an insert.</w:t>
+        <w:t xml:space="preserve"> Reference queries that scan everything are</w:t>
       </w:r>
     </w:p>
     <w:p>
@@ -796,16 +823,31 @@
         <w:jc w:val="both"/>
       </w:pPr>
       <w:r>
-        <w:t xml:space="preserve">Two things do </w:t>
+        <w:t>too slow to run on every build, and ten questions are not a test set: frozen samples with checksums, a hold-out question set, and monitoring of guard refusals, query cost, rule trends and entitlement changes.</w:t>
       </w:r>
+    </w:p>
+    <w:p>
+      <w:pPr>
+        <w:spacing w:after="60"/>
+        <w:jc w:val="both"/>
+      </w:pPr>
+      <w:r>
+        <w:t>What does not break is the place the filter sits and the semantic layer's size: about 8,400 tokens at any volume, though many more entities would need retrieval instead of one pack. A single PostgreSQL node is the wrong host for 10 TB; PostgreSQL with Citus, or a columnar MPP engine such as ClickHouse or StarRocks, carrying the same schemas, rules and policy model, is the port to evaluate.</w:t>
+      </w:r>
+    </w:p>
+    <w:p>
+      <w:pPr>
+        <w:spacing w:after="60"/>
+        <w:jc w:val="both"/>
+      </w:pPr>
       <w:r>
         <w:rPr>
           <w:b/>
         </w:rPr>
-        <w:t>not</w:t>
+        <w:t>Assumptions and residual risks.</w:t>
       </w:r>
       <w:r>
-        <w:t xml:space="preserve"> break, and they are the parts worth keeping: the semantic layer (a few thousand tokens regardless of volume, and the thing that decides whether the model is right) and the place the filter sits (in the engine, not in the prompt). What would change about the engine is the engine: a single PostgreSQL node is the wrong host for 10 TB, and the on-premises choices worth evaluating are PostgreSQL with Citus for scale-out, or a columnar MPP engine such as ClickHouse or StarRocks, with the same schemas, the same rule set and the same policy model ported onto it. The decision to keep the stack small is what makes that port a week of work rather than a rewrite.</w:t>
+        <w:t xml:space="preserve"> [ASSUMED]: problematic = B or D (A4), interest postings count as incoming money (A7), every amount is CZK (A19), calendar not fiscal. Residual: the recorded Claude run predates the current semantic pack; the intent verifier and the month-end tie-break fix are not built; there is no read audit; and the second-factor lockout counts only failures the client commits, so a direct connection holding a stolen password can keep guessing.</w:t>
       </w:r>
     </w:p>
     <w:p>
@@ -818,7 +860,7 @@
           <w:color w:val="808080"/>
           <w:sz w:val="13"/>
         </w:rPr>
-        <w:t>Generated by `make ddr` at 2026-10-25T11:34:44+00:00 (git a7da25a). Source text: deliverables/DDR_source.md</w:t>
+        <w:t>Generated by `make ddr` at 2026-10-28T16:11:54+00:00 (git b5b18f2). Source text: deliverables/DDR_source.md</w:t>
       </w:r>
     </w:p>
     <w:sectPr>

</xml_diff>